<commit_message>
finished POC of mirror plan code.
</commit_message>
<xml_diff>
--- a/mirrorPlansDesign.docx
+++ b/mirrorPlansDesign.docx
@@ -32,43 +32,7 @@
         <w:rPr>
           <w:highlight w:val="white"/>
         </w:rPr>
-        <w:t>1. The company cost of a mirror plan w</w:t>
-      </w:r>
-      <w:r>
-        <w:rPr>
-          <w:highlight w:val="white"/>
-        </w:rPr>
-        <w:t xml:space="preserve">ill be greater than the company </w:t>
-      </w:r>
-      <w:r>
-        <w:rPr>
-          <w:highlight w:val="white"/>
-        </w:rPr>
-        <w:t>cost for the same plan under an ordinary c</w:t>
-      </w:r>
-      <w:r>
-        <w:rPr>
-          <w:highlight w:val="white"/>
-        </w:rPr>
-        <w:t xml:space="preserve">ost structure.  This additional </w:t>
-      </w:r>
-      <w:r>
-        <w:rPr>
-          <w:highlight w:val="white"/>
-        </w:rPr>
-        <w:t>cost should be included in the calculatio</w:t>
-      </w:r>
-      <w:r>
-        <w:rPr>
-          <w:highlight w:val="white"/>
-        </w:rPr>
-        <w:t xml:space="preserve">n of estimates.  This is mostly </w:t>
-      </w:r>
-      <w:r>
-        <w:rPr>
-          <w:highlight w:val="white"/>
-        </w:rPr>
-        <w:t>a renewal concern rather than new client onboarding.</w:t>
+        <w:t>1. The company cost of a mirror plan will be greater than the company cost for the same plan under an ordinary cost structure.  This additional cost should be included in the calculation of estimates.  This is mostly a renewal concern rather than new client onboarding.</w:t>
       </w:r>
     </w:p>
     <w:p>
@@ -81,19 +45,7 @@
         <w:rPr>
           <w:highlight w:val="white"/>
         </w:rPr>
-        <w:t xml:space="preserve">2. During the submit transaction, when </w:t>
-      </w:r>
-      <w:r>
-        <w:rPr>
-          <w:highlight w:val="white"/>
-        </w:rPr>
-        <w:t xml:space="preserve">turning off non-selected plans, </w:t>
-      </w:r>
-      <w:r>
-        <w:rPr>
-          <w:highlight w:val="white"/>
-        </w:rPr>
-        <w:t>the mirror plans corresponding to plan selections should not be turned off.</w:t>
+        <w:t>2. During the submit transaction, when turning off non-selected plans, the mirror plans corresponding to plan selections should not be turned off.</w:t>
       </w:r>
     </w:p>
     <w:p>
@@ -106,31 +58,7 @@
         <w:rPr>
           <w:highlight w:val="white"/>
         </w:rPr>
-        <w:t xml:space="preserve">3. During the submit transaction, the rate </w:t>
-      </w:r>
-      <w:r>
-        <w:rPr>
-          <w:highlight w:val="white"/>
-        </w:rPr>
-        <w:t xml:space="preserve">contributions for mirror plans </w:t>
-      </w:r>
-      <w:r>
-        <w:rPr>
-          <w:highlight w:val="white"/>
-        </w:rPr>
-        <w:t>must be calculated and the rate tables updat</w:t>
-      </w:r>
-      <w:r>
-        <w:rPr>
-          <w:highlight w:val="white"/>
-        </w:rPr>
-        <w:t>ed to contain the FPL employee-</w:t>
-      </w:r>
-      <w:r>
-        <w:rPr>
-          <w:highlight w:val="white"/>
-        </w:rPr>
-        <w:t>cost of the plan and the corresponding company cost.</w:t>
+        <w:t>3. During the submit transaction, the rate contributions for mirror plans must be calculated and the rate tables updated to contain the FPL employee-cost of the plan and the corresponding company cost.</w:t>
       </w:r>
     </w:p>
     <w:p>
@@ -3587,7 +3515,23 @@
       </w:r>
       <w:proofErr w:type="spellEnd"/>
       <w:r>
-        <w:t xml:space="preserve"> that builds a Set of benefit plans.  Either of these methods should be updated to scan the Map for selected plans and for each entry found, add the mirror plan to the Set.</w:t>
+        <w:t xml:space="preserve"> that also calls a static method </w:t>
+      </w:r>
+      <w:proofErr w:type="spellStart"/>
+      <w:r>
+        <w:t>getSelectedBenefitPlans</w:t>
+      </w:r>
+      <w:proofErr w:type="spellEnd"/>
+      <w:r>
+        <w:t xml:space="preserve">.  </w:t>
+      </w:r>
+      <w:r>
+        <w:t>This method can call a new method to search the mirror plan Map and add the mirror plan to the Set of selected plans</w:t>
+      </w:r>
+      <w:bookmarkStart w:id="0" w:name="_GoBack"/>
+      <w:bookmarkEnd w:id="0"/>
+      <w:r>
+        <w:t>.</w:t>
       </w:r>
       <w:r>
         <w:t xml:space="preserve">  </w:t>
@@ -3692,8 +3636,6 @@
       <w:r>
         <w:t xml:space="preserve"> object.  This object is used to build rates for the domestic partner plans but there are no domestic partner plans for the mirror plans, so this is not required.</w:t>
       </w:r>
-      <w:bookmarkStart w:id="0" w:name="_GoBack"/>
-      <w:bookmarkEnd w:id="0"/>
     </w:p>
     <w:p/>
     <w:p/>

</xml_diff>